<commit_message>
fix: update dispensasi.docx template variables
</commit_message>
<xml_diff>
--- a/public/dispensasi.docx
+++ b/public/dispensasi.docx
@@ -75,7 +75,7 @@
           <w:sz w:val="24"/>
           <w:szCs w:val="24"/>
         </w:rPr>
-        <w:t>&lt;&lt;nomor surat&gt;&gt;</w:t>
+        <w:t>&lt;&lt;nomorSurat&gt;&gt;</w:t>
       </w:r>
       <w:r>
         <w:rPr>
@@ -636,31 +636,7 @@
           <w:sz w:val="24"/>
           <w:szCs w:val="24"/>
         </w:rPr>
-        <w:t>Setelah selesai menurunkan barang, kendaraan kembali ke tempat parkir TMR dan</w:t>
-      </w:r>
-      <w:r>
-        <w:rPr>
-          <w:rFonts w:ascii="Arial" w:hAnsi="Arial" w:cs="Arial"/>
-          <w:sz w:val="24"/>
-          <w:szCs w:val="24"/>
-        </w:rPr>
-        <w:t xml:space="preserve"> </w:t>
-      </w:r>
-      <w:r>
-        <w:rPr>
-          <w:rFonts w:ascii="Arial" w:hAnsi="Arial" w:cs="Arial"/>
-          <w:sz w:val="24"/>
-          <w:szCs w:val="24"/>
-        </w:rPr>
-        <w:t>tidak diperkenankan parkir ditempat acara ataupun berkeliling didalam kawasan TMR</w:t>
-      </w:r>
-      <w:r>
-        <w:rPr>
-          <w:rFonts w:ascii="Arial" w:hAnsi="Arial" w:cs="Arial"/>
-          <w:sz w:val="24"/>
-          <w:szCs w:val="24"/>
-        </w:rPr>
-        <w:t>.</w:t>
+        <w:t>Setelah selesai menurunkan barang, kendaraan kembali ke tempat parkir TMR dan tidak diperkenankan parkir ditempat acara ataupun berkeliling didalam kawasan TMR.</w:t>
       </w:r>
       <w:r>
         <w:rPr>
@@ -1896,6 +1872,7 @@
   <w:style w:type="character" w:default="1" w:styleId="DefaultParagraphFont">
     <w:name w:val="Default Paragraph Font"/>
     <w:uiPriority w:val="1"/>
+    <w:semiHidden/>
     <w:unhideWhenUsed/>
   </w:style>
   <w:style w:type="table" w:default="1" w:styleId="TableNormal">

</xml_diff>